<commit_message>
Update PROMINE reference with published DOI; sync LaTeX and build script with submission-ready Word
- PROMINE (Schmidt 2025→2026) now published: doi:10.1007/s00134-026-08351-3
- Conclusions: shortened final sentence to match Word submission
- Data sharing: minor wording sync
- Author contributions: minor formatting sync

Co-Authored-By: Claude Opus 4.6 (1M context) <noreply@anthropic.com>
</commit_message>
<xml_diff>
--- a/manuscript/word/manuscript.docx
+++ b/manuscript/word/manuscript.docx
@@ -969,7 +969,40 @@
         <w:rPr>
           <w:sz w:val="22"/>
         </w:rPr>
-        <w:t>13. Schmidt RC, Zampieri FG, Ramos FJDS, et al. Propofol versus esketamine for rapid sequence intubation of critically ill patients (PROMINE): a randomized clinical trial. Intensive Care Med. 2025 (accepted).</w:t>
+        <w:t>13. Schmidt RC, Zampieri FG, Ramos FJDS, et al. Propofol versus esketamine for rapid sequence intubation of critically ill patients (PROMINE): a randomized clinical trial. Intensive Care Med. 202</w:t>
+      </w:r>
+      <w:r>
+        <w:rPr>
+          <w:sz w:val="22"/>
+        </w:rPr>
+        <w:t>6 (</w:t>
+      </w:r>
+      <w:r>
+        <w:rPr>
+          <w:sz w:val="22"/>
+        </w:rPr>
+        <w:t xml:space="preserve">Intensive Care Med (2026). </w:t>
+      </w:r>
+      <w:hyperlink r:id="rId6" w:history="1">
+        <w:r>
+          <w:rPr>
+            <w:rStyle w:val="Hyperlink"/>
+            <w:sz w:val="22"/>
+          </w:rPr>
+          <w:t>https://doi.org/10.1007/s00134-026-08351-3</w:t>
+        </w:r>
+      </w:hyperlink>
+      <w:r>
+        <w:rPr>
+          <w:sz w:val="22"/>
+        </w:rPr>
+        <w:t>, online first March 23, 2026</w:t>
+      </w:r>
+      <w:r>
+        <w:rPr>
+          <w:sz w:val="22"/>
+        </w:rPr>
+        <w:t>).</w:t>
       </w:r>
     </w:p>
     <w:p>
@@ -3905,11 +3938,13 @@
         <w:pStyle w:val="Heading1"/>
       </w:pPr>
       <w:r>
-        <w:lastRenderedPageBreak/>
         <w:t>Figure Legends</w:t>
       </w:r>
     </w:p>
     <w:p>
+      <w:pPr>
+        <w:spacing w:line="240" w:lineRule="auto"/>
+      </w:pPr>
       <w:r>
         <w:rPr>
           <w:b/>
@@ -3918,6 +3953,126 @@
       </w:r>
       <w:r>
         <w:t>Study identification, screening, and inclusion process. MEDLINE and Embase were searched from inception to December 2025. Nine randomized controlled trials met the inclusion criteria.</w:t>
+      </w:r>
+    </w:p>
+    <w:p>
+      <w:pPr>
+        <w:spacing w:after="240"/>
+      </w:pPr>
+      <w:r>
+        <w:rPr>
+          <w:noProof/>
+        </w:rPr>
+        <w:lastRenderedPageBreak/>
+        <w:drawing>
+          <wp:inline distT="0" distB="0" distL="0" distR="0" wp14:anchorId="0D3384A5" wp14:editId="70C45B07">
+            <wp:extent cx="7820611" cy="4557010"/>
+            <wp:effectExtent l="0" t="0" r="3175" b="2540"/>
+            <wp:docPr id="1673585876" name="Picture 1"/>
+            <wp:cNvGraphicFramePr>
+              <a:graphicFrameLocks xmlns:a="http://schemas.openxmlformats.org/drawingml/2006/main" noChangeAspect="1"/>
+            </wp:cNvGraphicFramePr>
+            <a:graphic xmlns:a="http://schemas.openxmlformats.org/drawingml/2006/main">
+              <a:graphicData uri="http://schemas.openxmlformats.org/drawingml/2006/picture">
+                <pic:pic xmlns:pic="http://schemas.openxmlformats.org/drawingml/2006/picture">
+                  <pic:nvPicPr>
+                    <pic:cNvPr id="1673585876" name="Picture 1673585876"/>
+                    <pic:cNvPicPr/>
+                  </pic:nvPicPr>
+                  <pic:blipFill>
+                    <a:blip r:embed="rId7"/>
+                    <a:stretch>
+                      <a:fillRect/>
+                    </a:stretch>
+                  </pic:blipFill>
+                  <pic:spPr>
+                    <a:xfrm>
+                      <a:off x="0" y="0"/>
+                      <a:ext cx="7888342" cy="4596476"/>
+                    </a:xfrm>
+                    <a:prstGeom prst="rect">
+                      <a:avLst/>
+                    </a:prstGeom>
+                  </pic:spPr>
+                </pic:pic>
+              </a:graphicData>
+            </a:graphic>
+          </wp:inline>
+        </w:drawing>
+      </w:r>
+    </w:p>
+    <w:p>
+      <w:pPr>
+        <w:spacing w:after="200" w:line="276" w:lineRule="auto"/>
+        <w:rPr>
+          <w:b/>
+        </w:rPr>
+      </w:pPr>
+      <w:r>
+        <w:rPr>
+          <w:b/>
+        </w:rPr>
+        <w:br w:type="page"/>
+      </w:r>
+    </w:p>
+    <w:p>
+      <w:pPr>
+        <w:spacing w:line="240" w:lineRule="auto"/>
+      </w:pPr>
+      <w:r>
+        <w:rPr>
+          <w:b/>
+        </w:rPr>
+        <w:lastRenderedPageBreak/>
+        <w:t xml:space="preserve">Figure 2. Risk of bias assessment (Cochrane RoB 2 tool). </w:t>
+      </w:r>
+      <w:r>
+        <w:t>(A) Traffic-light plot showing domain-level judgements for each study. D1 = randomization process; D2 = deviations from intended interventions; D3 = missing outcome data; D4 = measurement of the outcome; D5 = selection of the reported result. (B) Summary plot showing the distribution of risk-of-bias judgements across all studies. Eight studies were rated as “some concerns” and one (Punt 2014) as “high risk,” driven by the cluster-randomized design and midazolam adjunct in the ketamine arm.</w:t>
+      </w:r>
+    </w:p>
+    <w:p>
+      <w:pPr>
+        <w:jc w:val="center"/>
+      </w:pPr>
+      <w:r>
+        <w:rPr>
+          <w:noProof/>
+        </w:rPr>
+        <w:drawing>
+          <wp:inline distT="0" distB="0" distL="0" distR="0" wp14:anchorId="2DE0B4FA" wp14:editId="38430D8C">
+            <wp:extent cx="3507699" cy="2867244"/>
+            <wp:effectExtent l="0" t="0" r="0" b="3175"/>
+            <wp:docPr id="1762137266" name="Picture 2"/>
+            <wp:cNvGraphicFramePr>
+              <a:graphicFrameLocks xmlns:a="http://schemas.openxmlformats.org/drawingml/2006/main" noChangeAspect="1"/>
+            </wp:cNvGraphicFramePr>
+            <a:graphic xmlns:a="http://schemas.openxmlformats.org/drawingml/2006/main">
+              <a:graphicData uri="http://schemas.openxmlformats.org/drawingml/2006/picture">
+                <pic:pic xmlns:pic="http://schemas.openxmlformats.org/drawingml/2006/picture">
+                  <pic:nvPicPr>
+                    <pic:cNvPr id="1762137266" name="Picture 1762137266"/>
+                    <pic:cNvPicPr/>
+                  </pic:nvPicPr>
+                  <pic:blipFill>
+                    <a:blip r:embed="rId8"/>
+                    <a:stretch>
+                      <a:fillRect/>
+                    </a:stretch>
+                  </pic:blipFill>
+                  <pic:spPr>
+                    <a:xfrm>
+                      <a:off x="0" y="0"/>
+                      <a:ext cx="3542004" cy="2895285"/>
+                    </a:xfrm>
+                    <a:prstGeom prst="rect">
+                      <a:avLst/>
+                    </a:prstGeom>
+                  </pic:spPr>
+                </pic:pic>
+              </a:graphicData>
+            </a:graphic>
+          </wp:inline>
+        </w:drawing>
       </w:r>
     </w:p>
     <w:p>
@@ -3926,35 +4081,120 @@
       </w:pPr>
     </w:p>
     <w:p>
-      <w:r>
+      <w:pPr>
+        <w:spacing w:after="200" w:line="276" w:lineRule="auto"/>
+        <w:jc w:val="center"/>
         <w:rPr>
           <w:b/>
         </w:rPr>
-        <w:t xml:space="preserve">Figure 2. Risk of bias assessment (Cochrane RoB 2 tool). </w:t>
-      </w:r>
-      <w:r>
-        <w:t>(A) Traffic-light plot showing domain-level judgements for each study. D1 = randomization process; D2 = deviations from intended interventions; D3 = missing outcome data; D4 = measurement of the outcome; D5 = selection of the reported result. (B) Summary plot showing the distribution of risk-of-bias judgements across all studies. Eight studies were rated as “some concerns” and one (Punt 2014) as “high risk,” driven by the cluster-randomized design and midazolam adjunct in the ketamine arm.</w:t>
+      </w:pPr>
+      <w:r>
+        <w:rPr>
+          <w:noProof/>
+        </w:rPr>
+        <w:drawing>
+          <wp:inline distT="0" distB="0" distL="0" distR="0" wp14:anchorId="1F019296" wp14:editId="1A6156D7">
+            <wp:extent cx="4781862" cy="1444776"/>
+            <wp:effectExtent l="0" t="0" r="0" b="3175"/>
+            <wp:docPr id="44209855" name="Picture 4"/>
+            <wp:cNvGraphicFramePr>
+              <a:graphicFrameLocks xmlns:a="http://schemas.openxmlformats.org/drawingml/2006/main" noChangeAspect="1"/>
+            </wp:cNvGraphicFramePr>
+            <a:graphic xmlns:a="http://schemas.openxmlformats.org/drawingml/2006/main">
+              <a:graphicData uri="http://schemas.openxmlformats.org/drawingml/2006/picture">
+                <pic:pic xmlns:pic="http://schemas.openxmlformats.org/drawingml/2006/picture">
+                  <pic:nvPicPr>
+                    <pic:cNvPr id="44209855" name="Picture 44209855"/>
+                    <pic:cNvPicPr/>
+                  </pic:nvPicPr>
+                  <pic:blipFill>
+                    <a:blip r:embed="rId9"/>
+                    <a:stretch>
+                      <a:fillRect/>
+                    </a:stretch>
+                  </pic:blipFill>
+                  <pic:spPr>
+                    <a:xfrm>
+                      <a:off x="0" y="0"/>
+                      <a:ext cx="4796824" cy="1449296"/>
+                    </a:xfrm>
+                    <a:prstGeom prst="rect">
+                      <a:avLst/>
+                    </a:prstGeom>
+                  </pic:spPr>
+                </pic:pic>
+              </a:graphicData>
+            </a:graphic>
+          </wp:inline>
+        </w:drawing>
+      </w:r>
+      <w:r>
+        <w:rPr>
+          <w:b/>
+        </w:rPr>
+        <w:br w:type="page"/>
       </w:r>
     </w:p>
     <w:p>
       <w:pPr>
-        <w:spacing w:after="240"/>
+        <w:spacing w:line="240" w:lineRule="auto"/>
       </w:pPr>
-    </w:p>
-    <w:p>
       <w:r>
         <w:rPr>
           <w:b/>
         </w:rPr>
+        <w:lastRenderedPageBreak/>
         <w:t xml:space="preserve">Figure 3. Network geometry and pairwise meta-analysis of etomidate vs ketamine for short-term mortality. </w:t>
       </w:r>
       <w:r>
         <w:t>(A) Network geometry for the mortality analysis. Node size is proportional to the total number of patients randomized to each treatment. Edge thickness is proportional to the number of studies for each direct comparison. The etomidate–ketamine comparison dominates the network (7 of 9 studies). (B) Forest plot showing the pairwise random-effects meta-analysis for etomidate vs ketamine (7 studies, 4,345 patients). Squares represent individual study estimates (size proportional to weight); the diamond represents the pooled estimate. The pooled OR was 1.02 (95% CI 0.77–1.36; 95% prediction interval 0.47–2.21; I² = 30%), consistent with no difference in mortality between agents.</w:t>
+      </w:r>
+    </w:p>
+    <w:p>
+      <w:r>
+        <w:rPr>
+          <w:noProof/>
+        </w:rPr>
+        <w:drawing>
+          <wp:inline distT="0" distB="0" distL="0" distR="0" wp14:anchorId="01324F01" wp14:editId="213ED592">
+            <wp:extent cx="8464089" cy="3949909"/>
+            <wp:effectExtent l="0" t="0" r="0" b="0"/>
+            <wp:docPr id="1025299808" name="Picture 5"/>
+            <wp:cNvGraphicFramePr>
+              <a:graphicFrameLocks xmlns:a="http://schemas.openxmlformats.org/drawingml/2006/main" noChangeAspect="1"/>
+            </wp:cNvGraphicFramePr>
+            <a:graphic xmlns:a="http://schemas.openxmlformats.org/drawingml/2006/main">
+              <a:graphicData uri="http://schemas.openxmlformats.org/drawingml/2006/picture">
+                <pic:pic xmlns:pic="http://schemas.openxmlformats.org/drawingml/2006/picture">
+                  <pic:nvPicPr>
+                    <pic:cNvPr id="1025299808" name="Picture 1025299808"/>
+                    <pic:cNvPicPr/>
+                  </pic:nvPicPr>
+                  <pic:blipFill>
+                    <a:blip r:embed="rId10"/>
+                    <a:stretch>
+                      <a:fillRect/>
+                    </a:stretch>
+                  </pic:blipFill>
+                  <pic:spPr>
+                    <a:xfrm>
+                      <a:off x="0" y="0"/>
+                      <a:ext cx="8578202" cy="4003162"/>
+                    </a:xfrm>
+                    <a:prstGeom prst="rect">
+                      <a:avLst/>
+                    </a:prstGeom>
+                  </pic:spPr>
+                </pic:pic>
+              </a:graphicData>
+            </a:graphic>
+          </wp:inline>
+        </w:drawing>
       </w:r>
     </w:p>
     <w:sectPr>
       <w:type w:val="continuous"/>
-      <w:pgSz w:w="12240" w:h="15840"/>
+      <w:pgSz w:w="15840" w:h="12240" w:orient="landscape"/>
       <w:pgMar w:top="1440" w:right="1440" w:bottom="1440" w:left="1440" w:header="720" w:footer="720" w:gutter="0"/>
       <w:cols w:space="720"/>
       <w:docGrid w:linePitch="360"/>
@@ -15552,6 +15792,29 @@
       </w:tcPr>
     </w:tblStylePr>
   </w:style>
+  <w:style w:type="character" w:styleId="Hyperlink">
+    <w:name w:val="Hyperlink"/>
+    <w:basedOn w:val="DefaultParagraphFont"/>
+    <w:uiPriority w:val="99"/>
+    <w:unhideWhenUsed/>
+    <w:rsid w:val="001A4C34"/>
+    <w:rPr>
+      <w:color w:val="0000FF" w:themeColor="hyperlink"/>
+      <w:u w:val="single"/>
+    </w:rPr>
+  </w:style>
+  <w:style w:type="character" w:styleId="UnresolvedMention">
+    <w:name w:val="Unresolved Mention"/>
+    <w:basedOn w:val="DefaultParagraphFont"/>
+    <w:uiPriority w:val="99"/>
+    <w:semiHidden/>
+    <w:unhideWhenUsed/>
+    <w:rsid w:val="001A4C34"/>
+    <w:rPr>
+      <w:color w:val="605E5C"/>
+      <w:shd w:val="clear" w:color="auto" w:fill="E1DFDD"/>
+    </w:rPr>
+  </w:style>
 </w:styles>
 </file>
 

</xml_diff>